<commit_message>
Update kv_rms_norm_rope_cache tutorial delivery
</commit_message>
<xml_diff>
--- a/third_party/ascend/tutorials/kv_rms_norm_rope_cache/KvRmsNormRopeCache算子设计方案.docx
+++ b/third_party/ascend/tutorials/kv_rms_norm_rope_cache/KvRmsNormRopeCache算子设计方案.docx
@@ -4,185 +4,117 @@
   <w:body>
     <w:p>
       <w:r>
-        <w:rPr>
-          <w:b/>
-          <w:sz w:val="36"/>
-        </w:rPr>
         <w:t>KvRmsNormRopeCache算子设计方案</w:t>
       </w:r>
     </w:p>
     <w:p>
       <w:r>
-        <w:rPr>
-          <w:b/>
-          <w:sz w:val="30"/>
-        </w:rPr>
-        <w:t>1. 算子功能</w:t>
+        <w:t>需求分析</w:t>
       </w:r>
     </w:p>
     <w:p>
       <w:r>
-        <w:t>本算子在BF16 decode场景中完成KV拆分、RoPE、RMSNorm和cache update。输出为更新后的K cache和CKV cache。</w:t>
+        <w:t>Decode KV split, RoPE, RMSNorm, and cache update; outputs updated K cache and CKV cache.</w:t>
       </w:r>
     </w:p>
     <w:p>
       <w:r>
-        <w:t>公开路径使用Dk=Dv=64；动态路径支持合法Dk+Dv=D，要求Dk为偶数。</w:t>
+        <w:t>输入：kv/gamma/cos/sin/index/cache tensors; BF16 data path with dynamic Dk/Dv validation。</w:t>
       </w:r>
     </w:p>
     <w:p>
       <w:r>
-        <w:rPr>
-          <w:b/>
-          <w:sz w:val="30"/>
-        </w:rPr>
-        <w:t>2. 接口与约束</w:t>
+        <w:t>输出：updated K cache and CKV cache tensors。</w:t>
       </w:r>
     </w:p>
     <w:p>
       <w:r>
-        <w:t>输入包括kv、gamma、cos、sin、index、kCacheRef、ckvCacheRef，属性epsilon和cache_mode。kCacheRef最后一维为Dk，ckvCacheRef最后一维为Dv。</w:t>
+        <w:t>当前实现分析、算子整体流程</w:t>
       </w:r>
     </w:p>
     <w:p>
       <w:r>
-        <w:t>实现要求输入连续，cache_mode=Norm，epsilon&gt;0。超出backend容量的split会fail loudly，不fallback。</w:t>
+        <w:t>Fast 64/64 split path plus generic dynamic Dk/Dv split path; unsupported metadata fails loudly.</w:t>
       </w:r>
     </w:p>
     <w:p>
       <w:r>
-        <w:rPr>
-          <w:b/>
-          <w:sz w:val="30"/>
-        </w:rPr>
-        <w:t>3. 实现方案</w:t>
+        <w:t>算子原型</w:t>
       </w:r>
     </w:p>
     <w:p>
       <w:r>
-        <w:t>Triton grid为(heads, B)，每个program处理一个head/batch并按Skv顺序写入cache。64/64走专用fast path，其他split走generic dynamic path。</w:t>
+        <w:t>源码 `kv_rms_norm_rope_cache.py`，统一推理入口 `run_inference.py`，校验脚本 `validate_kv_rms_norm_rope_cache.py`。</w:t>
       </w:r>
     </w:p>
     <w:p>
       <w:r>
-        <w:t>RoPE使用low/high half连续load，动态路径使用BLOCK_KH=next_power_of_2(Dk/2)和BLOCK_V=next_power_of_2(Dv)。</w:t>
+        <w:t>相关约束</w:t>
       </w:r>
     </w:p>
     <w:p>
       <w:r>
-        <w:rPr>
-          <w:b/>
-          <w:sz w:val="30"/>
-        </w:rPr>
-        <w:t>4. 精度与验证</w:t>
+        <w:t>不支持组合 fail loudly；被测路径无 fallback。</w:t>
       </w:r>
     </w:p>
     <w:p>
       <w:r>
-        <w:t>delivery正确性验证60/60通过；其中public 20，random dynamic split 40。</w:t>
+        <w:t>需求详细设计</w:t>
       </w:r>
     </w:p>
     <w:p>
       <w:r>
-        <w:t>OpForge动态审计40/40通过，failed 0。</w:t>
+        <w:t>调度仅依赖合法运行时元数据，不依赖 case id、workload、输入值或 timing signature。</w:t>
       </w:r>
     </w:p>
     <w:p>
       <w:r>
-        <w:rPr>
-          <w:b/>
-          <w:sz w:val="30"/>
-        </w:rPr>
-        <w:t>5. 性能证据</w:t>
+        <w:t>精度标准/性能标准</w:t>
       </w:r>
     </w:p>
     <w:p>
       <w:r>
-        <w:t>OpForge latest run eval_20260617_162945：20/20通过，active/active geomean 77.170667x，mean latency 77.675 us。</w:t>
+        <w:t>L1 指标口径参考 references/commercial_standard.md，RMSE/MERE/MARE 由本目录 checker 输出；本报告是教程自验证，不等同完整商业 L1 认证；主速度门槛按 torch_npu runnable all active/active 几何平均 &gt;= 1.2x，selected baseline 只作语义标杆说明。</w:t>
       </w:r>
     </w:p>
     <w:p>
       <w:r>
-        <w:t>历史best run eval_20260616_211136 active geomean 84.559295x；本交付选择latest动态split版本。</w:t>
+        <w:t>Baseline 自包含流程</w:t>
       </w:r>
     </w:p>
     <w:p>
       <w:r>
-        <w:rPr>
-          <w:b/>
-          <w:sz w:val="30"/>
-        </w:rPr>
-        <w:t>6. 无fallback边界</w:t>
-      </w:r>
-    </w:p>
-    <w:p>
-      <w:r>
-        <w:t>被测路径只调用本目录Triton-Ascend kernel，不调用任务golden、PyTorch等价实现、torch_npu whole op、CANN/vendor whole op、CPU fallback、peer或其他backend。</w:t>
-      </w:r>
-    </w:p>
-    <w:p>
-      <w:r>
-        <w:rPr>
-          <w:b/>
-          <w:sz w:val="30"/>
-        </w:rPr>
-        <w:t>7. 风险说明</w:t>
-      </w:r>
-    </w:p>
-    <w:p>
-      <w:r>
-        <w:t>当前OpForge public baseline为pytorch_fallback，不能从该证据扩写为对可用CANN whole-operator的直接1.2x结论。delivery benchmark为wall-sync sanity，正式性能引用OpForge active-window。</w:t>
+        <w:t>Torch 和 torch_npu baseline 均由本目录 run_inference.py 生成；torch_npu 只有运行成功且精度通过时才被选为 selected baseline；不读取或保留外部历史对照文件。</w:t>
       </w:r>
     </w:p>
     <w:tbl>
       <w:tblPr>
+        <w:tblStyle w:val="aa"/>
         <w:tblW w:type="auto" w:w="0"/>
         <w:tblLook w:firstColumn="1" w:firstRow="1" w:lastColumn="0" w:lastRow="0" w:noHBand="0" w:noVBand="1" w:val="04A0"/>
       </w:tblPr>
       <w:tblGrid>
-        <w:gridCol w:w="2076"/>
-        <w:gridCol w:w="2076"/>
-        <w:gridCol w:w="2076"/>
-        <w:gridCol w:w="2076"/>
+        <w:gridCol w:w="4153"/>
+        <w:gridCol w:w="4153"/>
       </w:tblGrid>
       <w:tr>
         <w:tc>
           <w:tcPr>
-            <w:tcW w:type="dxa" w:w="2076"/>
-          </w:tcPr>
-          <w:p>
-            <w:r>
-              <w:t>证据</w:t>
-            </w:r>
-          </w:p>
-        </w:tc>
-        <w:tc>
-          <w:tcPr>
-            <w:tcW w:type="dxa" w:w="2076"/>
-          </w:tcPr>
-          <w:p>
-            <w:r>
-              <w:t>路径/run_id</w:t>
-            </w:r>
-          </w:p>
-        </w:tc>
-        <w:tc>
-          <w:tcPr>
-            <w:tcW w:type="dxa" w:w="2076"/>
-          </w:tcPr>
-          <w:p>
-            <w:r>
-              <w:t>结果</w:t>
-            </w:r>
-          </w:p>
-        </w:tc>
-        <w:tc>
-          <w:tcPr>
-            <w:tcW w:type="dxa" w:w="2076"/>
-          </w:tcPr>
-          <w:p>
-            <w:r>
-              <w:t>说明</w:t>
+            <w:tcW w:type="dxa" w:w="4153"/>
+          </w:tcPr>
+          <w:p>
+            <w:r>
+              <w:t>指标</w:t>
+            </w:r>
+          </w:p>
+        </w:tc>
+        <w:tc>
+          <w:tcPr>
+            <w:tcW w:type="dxa" w:w="4153"/>
+          </w:tcPr>
+          <w:p>
+            <w:r>
+              <w:t>数值</w:t>
             </w:r>
           </w:p>
         </w:tc>
@@ -190,41 +122,21 @@
       <w:tr>
         <w:tc>
           <w:tcPr>
-            <w:tcW w:type="dxa" w:w="2076"/>
-          </w:tcPr>
-          <w:p>
-            <w:r>
-              <w:t>latest public</w:t>
-            </w:r>
-          </w:p>
-        </w:tc>
-        <w:tc>
-          <w:tcPr>
-            <w:tcW w:type="dxa" w:w="2076"/>
-          </w:tcPr>
-          <w:p>
-            <w:r>
-              <w:t>eval_20260617_162945</w:t>
-            </w:r>
-          </w:p>
-        </w:tc>
-        <w:tc>
-          <w:tcPr>
-            <w:tcW w:type="dxa" w:w="2076"/>
-          </w:tcPr>
-          <w:p>
-            <w:r>
-              <w:t>20/20 PASS</w:t>
-            </w:r>
-          </w:p>
-        </w:tc>
-        <w:tc>
-          <w:tcPr>
-            <w:tcW w:type="dxa" w:w="2076"/>
-          </w:tcPr>
-          <w:p>
-            <w:r>
-              <w:t>OpForge active-window</w:t>
+            <w:tcW w:type="dxa" w:w="4153"/>
+          </w:tcPr>
+          <w:p>
+            <w:r>
+              <w:t>evidence source</w:t>
+            </w:r>
+          </w:p>
+        </w:tc>
+        <w:tc>
+          <w:tcPr>
+            <w:tcW w:type="dxa" w:w="4153"/>
+          </w:tcPr>
+          <w:p>
+            <w:r>
+              <w:t>logs/kv_rms_norm_rope_cache_validation.jsonl</w:t>
             </w:r>
           </w:p>
         </w:tc>
@@ -232,41 +144,21 @@
       <w:tr>
         <w:tc>
           <w:tcPr>
-            <w:tcW w:type="dxa" w:w="2076"/>
-          </w:tcPr>
-          <w:p>
-            <w:r>
-              <w:t>dynamic audit</w:t>
-            </w:r>
-          </w:p>
-        </w:tc>
-        <w:tc>
-          <w:tcPr>
-            <w:tcW w:type="dxa" w:w="2076"/>
-          </w:tcPr>
-          <w:p>
-            <w:r>
-              <w:t>manual_generalization_audit_dkv_splitopt_20260617_1626</w:t>
-            </w:r>
-          </w:p>
-        </w:tc>
-        <w:tc>
-          <w:tcPr>
-            <w:tcW w:type="dxa" w:w="2076"/>
-          </w:tcPr>
-          <w:p>
-            <w:r>
-              <w:t>40/40 PASS</w:t>
-            </w:r>
-          </w:p>
-        </w:tc>
-        <w:tc>
-          <w:tcPr>
-            <w:tcW w:type="dxa" w:w="2076"/>
-          </w:tcPr>
-          <w:p>
-            <w:r>
-              <w:t>manual audit</w:t>
+            <w:tcW w:type="dxa" w:w="4153"/>
+          </w:tcPr>
+          <w:p>
+            <w:r>
+              <w:t>total cases</w:t>
+            </w:r>
+          </w:p>
+        </w:tc>
+        <w:tc>
+          <w:tcPr>
+            <w:tcW w:type="dxa" w:w="4153"/>
+          </w:tcPr>
+          <w:p>
+            <w:r>
+              <w:t>60</w:t>
             </w:r>
           </w:p>
         </w:tc>
@@ -274,41 +166,21 @@
       <w:tr>
         <w:tc>
           <w:tcPr>
-            <w:tcW w:type="dxa" w:w="2076"/>
-          </w:tcPr>
-          <w:p>
-            <w:r>
-              <w:t>delivery correctness</w:t>
-            </w:r>
-          </w:p>
-        </w:tc>
-        <w:tc>
-          <w:tcPr>
-            <w:tcW w:type="dxa" w:w="2076"/>
-          </w:tcPr>
-          <w:p>
-            <w:r>
-              <w:t>logs/kv_rms_norm_rope_cache_validation_20260617.log</w:t>
-            </w:r>
-          </w:p>
-        </w:tc>
-        <w:tc>
-          <w:tcPr>
-            <w:tcW w:type="dxa" w:w="2076"/>
-          </w:tcPr>
-          <w:p>
-            <w:r>
-              <w:t>60/60 PASS</w:t>
-            </w:r>
-          </w:p>
-        </w:tc>
-        <w:tc>
-          <w:tcPr>
-            <w:tcW w:type="dxa" w:w="2076"/>
-          </w:tcPr>
-          <w:p>
-            <w:r>
-              <w:t>NPU run</w:t>
+            <w:tcW w:type="dxa" w:w="4153"/>
+          </w:tcPr>
+          <w:p>
+            <w:r>
+              <w:t>public cases</w:t>
+            </w:r>
+          </w:p>
+        </w:tc>
+        <w:tc>
+          <w:tcPr>
+            <w:tcW w:type="dxa" w:w="4153"/>
+          </w:tcPr>
+          <w:p>
+            <w:r>
+              <w:t>20</w:t>
             </w:r>
           </w:p>
         </w:tc>
@@ -316,41 +188,892 @@
       <w:tr>
         <w:tc>
           <w:tcPr>
-            <w:tcW w:type="dxa" w:w="2076"/>
-          </w:tcPr>
-          <w:p>
-            <w:r>
-              <w:t>delivery benchmark</w:t>
-            </w:r>
-          </w:p>
-        </w:tc>
-        <w:tc>
-          <w:tcPr>
-            <w:tcW w:type="dxa" w:w="2076"/>
-          </w:tcPr>
-          <w:p>
-            <w:r>
-              <w:t>logs/kv_rms_norm_rope_cache_benchmark_20260617.log</w:t>
-            </w:r>
-          </w:p>
-        </w:tc>
-        <w:tc>
-          <w:tcPr>
-            <w:tcW w:type="dxa" w:w="2076"/>
-          </w:tcPr>
-          <w:p>
-            <w:r>
-              <w:t>20/20 PASS</w:t>
-            </w:r>
-          </w:p>
-        </w:tc>
-        <w:tc>
-          <w:tcPr>
-            <w:tcW w:type="dxa" w:w="2076"/>
-          </w:tcPr>
-          <w:p>
-            <w:r>
-              <w:t>wall-sync sanity</w:t>
+            <w:tcW w:type="dxa" w:w="4153"/>
+          </w:tcPr>
+          <w:p>
+            <w:r>
+              <w:t>random/generalization cases</w:t>
+            </w:r>
+          </w:p>
+        </w:tc>
+        <w:tc>
+          <w:tcPr>
+            <w:tcW w:type="dxa" w:w="4153"/>
+          </w:tcPr>
+          <w:p>
+            <w:r>
+              <w:t>40</w:t>
+            </w:r>
+          </w:p>
+        </w:tc>
+      </w:tr>
+      <w:tr>
+        <w:tc>
+          <w:tcPr>
+            <w:tcW w:type="dxa" w:w="4153"/>
+          </w:tcPr>
+          <w:p>
+            <w:r>
+              <w:t>candidate pass</w:t>
+            </w:r>
+          </w:p>
+        </w:tc>
+        <w:tc>
+          <w:tcPr>
+            <w:tcW w:type="dxa" w:w="4153"/>
+          </w:tcPr>
+          <w:p>
+            <w:r>
+              <w:t>60/60</w:t>
+            </w:r>
+          </w:p>
+        </w:tc>
+      </w:tr>
+      <w:tr>
+        <w:tc>
+          <w:tcPr>
+            <w:tcW w:type="dxa" w:w="4153"/>
+          </w:tcPr>
+          <w:p>
+            <w:r>
+              <w:t>main speed sample</w:t>
+            </w:r>
+          </w:p>
+        </w:tc>
+        <w:tc>
+          <w:tcPr>
+            <w:tcW w:type="dxa" w:w="4153"/>
+          </w:tcPr>
+          <w:p>
+            <w:r>
+              <w:t>torch_npu runnable all (0 cases)</w:t>
+            </w:r>
+          </w:p>
+        </w:tc>
+      </w:tr>
+      <w:tr>
+        <w:tc>
+          <w:tcPr>
+            <w:tcW w:type="dxa" w:w="4153"/>
+          </w:tcPr>
+          <w:p>
+            <w:r>
+              <w:t>main speed candidate active geomean</w:t>
+            </w:r>
+          </w:p>
+        </w:tc>
+        <w:tc>
+          <w:tcPr>
+            <w:tcW w:type="dxa" w:w="4153"/>
+          </w:tcPr>
+          <w:p>
+            <w:r>
+              <w:t>N/A</w:t>
+            </w:r>
+          </w:p>
+        </w:tc>
+      </w:tr>
+      <w:tr>
+        <w:tc>
+          <w:tcPr>
+            <w:tcW w:type="dxa" w:w="4153"/>
+          </w:tcPr>
+          <w:p>
+            <w:r>
+              <w:t>main speed torch_npu active geomean</w:t>
+            </w:r>
+          </w:p>
+        </w:tc>
+        <w:tc>
+          <w:tcPr>
+            <w:tcW w:type="dxa" w:w="4153"/>
+          </w:tcPr>
+          <w:p>
+            <w:r>
+              <w:t>N/A</w:t>
+            </w:r>
+          </w:p>
+        </w:tc>
+      </w:tr>
+      <w:tr>
+        <w:tc>
+          <w:tcPr>
+            <w:tcW w:type="dxa" w:w="4153"/>
+          </w:tcPr>
+          <w:p>
+            <w:r>
+              <w:t>main speed active/active geomean speedup</w:t>
+            </w:r>
+          </w:p>
+        </w:tc>
+        <w:tc>
+          <w:tcPr>
+            <w:tcW w:type="dxa" w:w="4153"/>
+          </w:tcPr>
+          <w:p>
+            <w:r>
+              <w:t>N/A</w:t>
+            </w:r>
+          </w:p>
+        </w:tc>
+      </w:tr>
+      <w:tr>
+        <w:tc>
+          <w:tcPr>
+            <w:tcW w:type="dxa" w:w="4153"/>
+          </w:tcPr>
+          <w:p>
+            <w:r>
+              <w:t>main speed gate</w:t>
+            </w:r>
+          </w:p>
+        </w:tc>
+        <w:tc>
+          <w:tcPr>
+            <w:tcW w:type="dxa" w:w="4153"/>
+          </w:tcPr>
+          <w:p>
+            <w:r>
+              <w:t>N/A (no torch_npu runnable timed case)</w:t>
+            </w:r>
+          </w:p>
+        </w:tc>
+      </w:tr>
+      <w:tr>
+        <w:tc>
+          <w:tcPr>
+            <w:tcW w:type="dxa" w:w="4153"/>
+          </w:tcPr>
+          <w:p>
+            <w:r>
+              <w:t>overall selected baseline split</w:t>
+            </w:r>
+          </w:p>
+        </w:tc>
+        <w:tc>
+          <w:tcPr>
+            <w:tcW w:type="dxa" w:w="4153"/>
+          </w:tcPr>
+          <w:p>
+            <w:r>
+              <w:t>torch=60</w:t>
+            </w:r>
+          </w:p>
+        </w:tc>
+      </w:tr>
+      <w:tr>
+        <w:tc>
+          <w:tcPr>
+            <w:tcW w:type="dxa" w:w="4153"/>
+          </w:tcPr>
+          <w:p>
+            <w:r>
+              <w:t>public selected baseline split</w:t>
+            </w:r>
+          </w:p>
+        </w:tc>
+        <w:tc>
+          <w:tcPr>
+            <w:tcW w:type="dxa" w:w="4153"/>
+          </w:tcPr>
+          <w:p>
+            <w:r>
+              <w:t>torch=20</w:t>
+            </w:r>
+          </w:p>
+        </w:tc>
+      </w:tr>
+      <w:tr>
+        <w:tc>
+          <w:tcPr>
+            <w:tcW w:type="dxa" w:w="4153"/>
+          </w:tcPr>
+          <w:p>
+            <w:r>
+              <w:t>overall torch_npu runnable all</w:t>
+            </w:r>
+          </w:p>
+        </w:tc>
+        <w:tc>
+          <w:tcPr>
+            <w:tcW w:type="dxa" w:w="4153"/>
+          </w:tcPr>
+          <w:p>
+            <w:r>
+              <w:t>0</w:t>
+            </w:r>
+          </w:p>
+        </w:tc>
+      </w:tr>
+      <w:tr>
+        <w:tc>
+          <w:tcPr>
+            <w:tcW w:type="dxa" w:w="4153"/>
+          </w:tcPr>
+          <w:p>
+            <w:r>
+              <w:t>overall torch_npu accuracy pass/fail</w:t>
+            </w:r>
+          </w:p>
+        </w:tc>
+        <w:tc>
+          <w:tcPr>
+            <w:tcW w:type="dxa" w:w="4153"/>
+          </w:tcPr>
+          <w:p>
+            <w:r>
+              <w:t>0/0</w:t>
+            </w:r>
+          </w:p>
+        </w:tc>
+      </w:tr>
+      <w:tr>
+        <w:tc>
+          <w:tcPr>
+            <w:tcW w:type="dxa" w:w="4153"/>
+          </w:tcPr>
+          <w:p>
+            <w:r>
+              <w:t>torch_npu runnable-all active speedup geomean</w:t>
+            </w:r>
+          </w:p>
+        </w:tc>
+        <w:tc>
+          <w:tcPr>
+            <w:tcW w:type="dxa" w:w="4153"/>
+          </w:tcPr>
+          <w:p>
+            <w:r>
+              <w:t>N/A</w:t>
+            </w:r>
+          </w:p>
+        </w:tc>
+      </w:tr>
+      <w:tr>
+        <w:tc>
+          <w:tcPr>
+            <w:tcW w:type="dxa" w:w="4153"/>
+          </w:tcPr>
+          <w:p>
+            <w:r>
+              <w:t>torch_npu runnable-all speed gate</w:t>
+            </w:r>
+          </w:p>
+        </w:tc>
+        <w:tc>
+          <w:tcPr>
+            <w:tcW w:type="dxa" w:w="4153"/>
+          </w:tcPr>
+          <w:p>
+            <w:r>
+              <w:t>N/A (no torch_npu runnable timed case)</w:t>
+            </w:r>
+          </w:p>
+        </w:tc>
+      </w:tr>
+      <w:tr>
+        <w:tc>
+          <w:tcPr>
+            <w:tcW w:type="dxa" w:w="4153"/>
+          </w:tcPr>
+          <w:p>
+            <w:r>
+              <w:t>public torch_npu runnable all</w:t>
+            </w:r>
+          </w:p>
+        </w:tc>
+        <w:tc>
+          <w:tcPr>
+            <w:tcW w:type="dxa" w:w="4153"/>
+          </w:tcPr>
+          <w:p>
+            <w:r>
+              <w:t>0</w:t>
+            </w:r>
+          </w:p>
+        </w:tc>
+      </w:tr>
+      <w:tr>
+        <w:tc>
+          <w:tcPr>
+            <w:tcW w:type="dxa" w:w="4153"/>
+          </w:tcPr>
+          <w:p>
+            <w:r>
+              <w:t>public torch_npu accuracy pass/fail</w:t>
+            </w:r>
+          </w:p>
+        </w:tc>
+        <w:tc>
+          <w:tcPr>
+            <w:tcW w:type="dxa" w:w="4153"/>
+          </w:tcPr>
+          <w:p>
+            <w:r>
+              <w:t>0/0</w:t>
+            </w:r>
+          </w:p>
+        </w:tc>
+      </w:tr>
+      <w:tr>
+        <w:tc>
+          <w:tcPr>
+            <w:tcW w:type="dxa" w:w="4153"/>
+          </w:tcPr>
+          <w:p>
+            <w:r>
+              <w:t>aux public candidate active geomean</w:t>
+            </w:r>
+          </w:p>
+        </w:tc>
+        <w:tc>
+          <w:tcPr>
+            <w:tcW w:type="dxa" w:w="4153"/>
+          </w:tcPr>
+          <w:p>
+            <w:r>
+              <w:t>80.561 us</w:t>
+            </w:r>
+          </w:p>
+        </w:tc>
+      </w:tr>
+      <w:tr>
+        <w:tc>
+          <w:tcPr>
+            <w:tcW w:type="dxa" w:w="4153"/>
+          </w:tcPr>
+          <w:p>
+            <w:r>
+              <w:t>aux public selected baseline active geomean</w:t>
+            </w:r>
+          </w:p>
+        </w:tc>
+        <w:tc>
+          <w:tcPr>
+            <w:tcW w:type="dxa" w:w="4153"/>
+          </w:tcPr>
+          <w:p>
+            <w:r>
+              <w:t>N/A</w:t>
+            </w:r>
+          </w:p>
+        </w:tc>
+      </w:tr>
+      <w:tr>
+        <w:tc>
+          <w:tcPr>
+            <w:tcW w:type="dxa" w:w="4153"/>
+          </w:tcPr>
+          <w:p>
+            <w:r>
+              <w:t>aux public selected active/active geomean speedup</w:t>
+            </w:r>
+          </w:p>
+        </w:tc>
+        <w:tc>
+          <w:tcPr>
+            <w:tcW w:type="dxa" w:w="4153"/>
+          </w:tcPr>
+          <w:p>
+            <w:r>
+              <w:t>N/A</w:t>
+            </w:r>
+          </w:p>
+        </w:tc>
+      </w:tr>
+      <w:tr>
+        <w:tc>
+          <w:tcPr>
+            <w:tcW w:type="dxa" w:w="4153"/>
+          </w:tcPr>
+          <w:p>
+            <w:r>
+              <w:t>max candidate RMSE</w:t>
+            </w:r>
+          </w:p>
+        </w:tc>
+        <w:tc>
+          <w:tcPr>
+            <w:tcW w:type="dxa" w:w="4153"/>
+          </w:tcPr>
+          <w:p>
+            <w:r>
+              <w:t>1.9895e-05</w:t>
+            </w:r>
+          </w:p>
+        </w:tc>
+      </w:tr>
+      <w:tr>
+        <w:tc>
+          <w:tcPr>
+            <w:tcW w:type="dxa" w:w="4153"/>
+          </w:tcPr>
+          <w:p>
+            <w:r>
+              <w:t>commercial standard</w:t>
+            </w:r>
+          </w:p>
+        </w:tc>
+        <w:tc>
+          <w:tcPr>
+            <w:tcW w:type="dxa" w:w="4153"/>
+          </w:tcPr>
+          <w:p>
+            <w:r>
+              <w:t>references/commercial_standard.md @ c260c8ab7a9be4823ac8f8a07c60442de9bf141e</w:t>
+            </w:r>
+          </w:p>
+        </w:tc>
+      </w:tr>
+    </w:tbl>
+    <w:p>
+      <w:r>
+        <w:t>性能口径汇总</w:t>
+      </w:r>
+    </w:p>
+    <w:tbl>
+      <w:tblPr>
+        <w:tblStyle w:val="aa"/>
+        <w:tblW w:type="auto" w:w="0"/>
+        <w:tblLook w:firstColumn="1" w:firstRow="1" w:lastColumn="0" w:lastRow="0" w:noHBand="0" w:noVBand="1" w:val="04A0"/>
+      </w:tblPr>
+      <w:tblGrid>
+        <w:gridCol w:w="1187"/>
+        <w:gridCol w:w="1187"/>
+        <w:gridCol w:w="1187"/>
+        <w:gridCol w:w="1187"/>
+        <w:gridCol w:w="1187"/>
+        <w:gridCol w:w="1187"/>
+        <w:gridCol w:w="1187"/>
+      </w:tblGrid>
+      <w:tr>
+        <w:tc>
+          <w:tcPr>
+            <w:tcW w:type="dxa" w:w="1187"/>
+          </w:tcPr>
+          <w:p>
+            <w:r>
+              <w:t>Scope</w:t>
+            </w:r>
+          </w:p>
+        </w:tc>
+        <w:tc>
+          <w:tcPr>
+            <w:tcW w:type="dxa" w:w="1187"/>
+          </w:tcPr>
+          <w:p>
+            <w:r>
+              <w:t>Cases</w:t>
+            </w:r>
+          </w:p>
+        </w:tc>
+        <w:tc>
+          <w:tcPr>
+            <w:tcW w:type="dxa" w:w="1187"/>
+          </w:tcPr>
+          <w:p>
+            <w:r>
+              <w:t>Candidate active geomean</w:t>
+            </w:r>
+          </w:p>
+        </w:tc>
+        <w:tc>
+          <w:tcPr>
+            <w:tcW w:type="dxa" w:w="1187"/>
+          </w:tcPr>
+          <w:p>
+            <w:r>
+              <w:t>Baseline active geomean</w:t>
+            </w:r>
+          </w:p>
+        </w:tc>
+        <w:tc>
+          <w:tcPr>
+            <w:tcW w:type="dxa" w:w="1187"/>
+          </w:tcPr>
+          <w:p>
+            <w:r>
+              <w:t>Active/active geomean speedup</w:t>
+            </w:r>
+          </w:p>
+        </w:tc>
+        <w:tc>
+          <w:tcPr>
+            <w:tcW w:type="dxa" w:w="1187"/>
+          </w:tcPr>
+          <w:p>
+            <w:r>
+              <w:t>Precision pass</w:t>
+            </w:r>
+          </w:p>
+        </w:tc>
+        <w:tc>
+          <w:tcPr>
+            <w:tcW w:type="dxa" w:w="1187"/>
+          </w:tcPr>
+          <w:p>
+            <w:r>
+              <w:t>Note</w:t>
+            </w:r>
+          </w:p>
+        </w:tc>
+      </w:tr>
+      <w:tr>
+        <w:tc>
+          <w:tcPr>
+            <w:tcW w:type="dxa" w:w="1187"/>
+          </w:tcPr>
+          <w:p>
+            <w:r>
+              <w:t>main torch_npu timed sample</w:t>
+            </w:r>
+          </w:p>
+        </w:tc>
+        <w:tc>
+          <w:tcPr>
+            <w:tcW w:type="dxa" w:w="1187"/>
+          </w:tcPr>
+          <w:p>
+            <w:r>
+              <w:t>0</w:t>
+            </w:r>
+          </w:p>
+        </w:tc>
+        <w:tc>
+          <w:tcPr>
+            <w:tcW w:type="dxa" w:w="1187"/>
+          </w:tcPr>
+          <w:p>
+            <w:r>
+              <w:t>N/A</w:t>
+            </w:r>
+          </w:p>
+        </w:tc>
+        <w:tc>
+          <w:tcPr>
+            <w:tcW w:type="dxa" w:w="1187"/>
+          </w:tcPr>
+          <w:p>
+            <w:r>
+              <w:t>N/A</w:t>
+            </w:r>
+          </w:p>
+        </w:tc>
+        <w:tc>
+          <w:tcPr>
+            <w:tcW w:type="dxa" w:w="1187"/>
+          </w:tcPr>
+          <w:p>
+            <w:r>
+              <w:t>N/A</w:t>
+            </w:r>
+          </w:p>
+        </w:tc>
+        <w:tc>
+          <w:tcPr>
+            <w:tcW w:type="dxa" w:w="1187"/>
+          </w:tcPr>
+          <w:p>
+            <w:r>
+              <w:t>0/0</w:t>
+            </w:r>
+          </w:p>
+        </w:tc>
+        <w:tc>
+          <w:tcPr>
+            <w:tcW w:type="dxa" w:w="1187"/>
+          </w:tcPr>
+          <w:p>
+            <w:r>
+              <w:t>主速度验收口径；candidate 和 torch_npu 均只在这同一批有 torch_npu active 计时的 case 上取几何平均；gate &gt;= 1.2x</w:t>
+            </w:r>
+          </w:p>
+        </w:tc>
+      </w:tr>
+      <w:tr>
+        <w:tc>
+          <w:tcPr>
+            <w:tcW w:type="dxa" w:w="1187"/>
+          </w:tcPr>
+          <w:p>
+            <w:r>
+              <w:t>torch_npu accuracy-pass</w:t>
+            </w:r>
+          </w:p>
+        </w:tc>
+        <w:tc>
+          <w:tcPr>
+            <w:tcW w:type="dxa" w:w="1187"/>
+          </w:tcPr>
+          <w:p>
+            <w:r>
+              <w:t>0</w:t>
+            </w:r>
+          </w:p>
+        </w:tc>
+        <w:tc>
+          <w:tcPr>
+            <w:tcW w:type="dxa" w:w="1187"/>
+          </w:tcPr>
+          <w:p>
+            <w:r>
+              <w:t>N/A</w:t>
+            </w:r>
+          </w:p>
+        </w:tc>
+        <w:tc>
+          <w:tcPr>
+            <w:tcW w:type="dxa" w:w="1187"/>
+          </w:tcPr>
+          <w:p>
+            <w:r>
+              <w:t>N/A</w:t>
+            </w:r>
+          </w:p>
+        </w:tc>
+        <w:tc>
+          <w:tcPr>
+            <w:tcW w:type="dxa" w:w="1187"/>
+          </w:tcPr>
+          <w:p>
+            <w:r>
+              <w:t>N/A</w:t>
+            </w:r>
+          </w:p>
+        </w:tc>
+        <w:tc>
+          <w:tcPr>
+            <w:tcW w:type="dxa" w:w="1187"/>
+          </w:tcPr>
+          <w:p>
+            <w:r>
+              <w:t>0/0</w:t>
+            </w:r>
+          </w:p>
+        </w:tc>
+        <w:tc>
+          <w:tcPr>
+            <w:tcW w:type="dxa" w:w="1187"/>
+          </w:tcPr>
+          <w:p>
+            <w:r>
+              <w:t>全量 torch_npu 有效计时且本地 checker PASS 子集</w:t>
+            </w:r>
+          </w:p>
+        </w:tc>
+      </w:tr>
+      <w:tr>
+        <w:tc>
+          <w:tcPr>
+            <w:tcW w:type="dxa" w:w="1187"/>
+          </w:tcPr>
+          <w:p>
+            <w:r>
+              <w:t>torch_npu accuracy-fail</w:t>
+            </w:r>
+          </w:p>
+        </w:tc>
+        <w:tc>
+          <w:tcPr>
+            <w:tcW w:type="dxa" w:w="1187"/>
+          </w:tcPr>
+          <w:p>
+            <w:r>
+              <w:t>0</w:t>
+            </w:r>
+          </w:p>
+        </w:tc>
+        <w:tc>
+          <w:tcPr>
+            <w:tcW w:type="dxa" w:w="1187"/>
+          </w:tcPr>
+          <w:p>
+            <w:r>
+              <w:t>N/A</w:t>
+            </w:r>
+          </w:p>
+        </w:tc>
+        <w:tc>
+          <w:tcPr>
+            <w:tcW w:type="dxa" w:w="1187"/>
+          </w:tcPr>
+          <w:p>
+            <w:r>
+              <w:t>N/A</w:t>
+            </w:r>
+          </w:p>
+        </w:tc>
+        <w:tc>
+          <w:tcPr>
+            <w:tcW w:type="dxa" w:w="1187"/>
+          </w:tcPr>
+          <w:p>
+            <w:r>
+              <w:t>N/A</w:t>
+            </w:r>
+          </w:p>
+        </w:tc>
+        <w:tc>
+          <w:tcPr>
+            <w:tcW w:type="dxa" w:w="1187"/>
+          </w:tcPr>
+          <w:p>
+            <w:r>
+              <w:t>0/0</w:t>
+            </w:r>
+          </w:p>
+        </w:tc>
+        <w:tc>
+          <w:tcPr>
+            <w:tcW w:type="dxa" w:w="1187"/>
+          </w:tcPr>
+          <w:p>
+            <w:r>
+              <w:t>全量 torch_npu 有效计时但本地 checker FAIL 子集</w:t>
+            </w:r>
+          </w:p>
+        </w:tc>
+      </w:tr>
+      <w:tr>
+        <w:tc>
+          <w:tcPr>
+            <w:tcW w:type="dxa" w:w="1187"/>
+          </w:tcPr>
+          <w:p>
+            <w:r>
+              <w:t>aux public selected baseline</w:t>
+            </w:r>
+          </w:p>
+        </w:tc>
+        <w:tc>
+          <w:tcPr>
+            <w:tcW w:type="dxa" w:w="1187"/>
+          </w:tcPr>
+          <w:p>
+            <w:r>
+              <w:t>20</w:t>
+            </w:r>
+          </w:p>
+        </w:tc>
+        <w:tc>
+          <w:tcPr>
+            <w:tcW w:type="dxa" w:w="1187"/>
+          </w:tcPr>
+          <w:p>
+            <w:r>
+              <w:t>80.561 us</w:t>
+            </w:r>
+          </w:p>
+        </w:tc>
+        <w:tc>
+          <w:tcPr>
+            <w:tcW w:type="dxa" w:w="1187"/>
+          </w:tcPr>
+          <w:p>
+            <w:r>
+              <w:t>N/A</w:t>
+            </w:r>
+          </w:p>
+        </w:tc>
+        <w:tc>
+          <w:tcPr>
+            <w:tcW w:type="dxa" w:w="1187"/>
+          </w:tcPr>
+          <w:p>
+            <w:r>
+              <w:t>N/A</w:t>
+            </w:r>
+          </w:p>
+        </w:tc>
+        <w:tc>
+          <w:tcPr>
+            <w:tcW w:type="dxa" w:w="1187"/>
+          </w:tcPr>
+          <w:p>
+            <w:r>
+              <w:t>20/20</w:t>
+            </w:r>
+          </w:p>
+        </w:tc>
+        <w:tc>
+          <w:tcPr>
+            <w:tcW w:type="dxa" w:w="1187"/>
+          </w:tcPr>
+          <w:p>
+            <w:r>
+              <w:t>补充语义标杆口径；torch_npu 仅在本地 checker 通过时选中，否则选 Torch</w:t>
+            </w:r>
+          </w:p>
+        </w:tc>
+      </w:tr>
+      <w:tr>
+        <w:tc>
+          <w:tcPr>
+            <w:tcW w:type="dxa" w:w="1187"/>
+          </w:tcPr>
+          <w:p>
+            <w:r>
+              <w:t>aux public torch semantic baseline</w:t>
+            </w:r>
+          </w:p>
+        </w:tc>
+        <w:tc>
+          <w:tcPr>
+            <w:tcW w:type="dxa" w:w="1187"/>
+          </w:tcPr>
+          <w:p>
+            <w:r>
+              <w:t>20</w:t>
+            </w:r>
+          </w:p>
+        </w:tc>
+        <w:tc>
+          <w:tcPr>
+            <w:tcW w:type="dxa" w:w="1187"/>
+          </w:tcPr>
+          <w:p>
+            <w:r>
+              <w:t>80.561 us</w:t>
+            </w:r>
+          </w:p>
+        </w:tc>
+        <w:tc>
+          <w:tcPr>
+            <w:tcW w:type="dxa" w:w="1187"/>
+          </w:tcPr>
+          <w:p>
+            <w:r>
+              <w:t>N/A</w:t>
+            </w:r>
+          </w:p>
+        </w:tc>
+        <w:tc>
+          <w:tcPr>
+            <w:tcW w:type="dxa" w:w="1187"/>
+          </w:tcPr>
+          <w:p>
+            <w:r>
+              <w:t>N/A</w:t>
+            </w:r>
+          </w:p>
+        </w:tc>
+        <w:tc>
+          <w:tcPr>
+            <w:tcW w:type="dxa" w:w="1187"/>
+          </w:tcPr>
+          <w:p>
+            <w:r>
+              <w:t>20/20</w:t>
+            </w:r>
+          </w:p>
+        </w:tc>
+        <w:tc>
+          <w:tcPr>
+            <w:tcW w:type="dxa" w:w="1187"/>
+          </w:tcPr>
+          <w:p>
+            <w:r>
+              <w:t>补充 Torch 语义参考口径，始终作为精度语义基准</w:t>
             </w:r>
           </w:p>
         </w:tc>

</xml_diff>